<commit_message>
docs: update cms_admin_api_integration_guide.docx with new Mood CRUD, Category updates, and correct gateway paths
</commit_message>
<xml_diff>
--- a/cms_admin_api_integration_guide.docx
+++ b/cms_admin_api_integration_guide.docx
@@ -81,7 +81,7 @@
         <w:t xml:space="preserve">• API Gateway Endpoint: </w:t>
       </w:r>
       <w:r>
-        <w:t>http://localhost:18080</w:t>
+        <w:t>http://103.154.62.118:18080 (hoặc http://localhost:18080)</w:t>
         <w:br/>
       </w:r>
       <w:r>
@@ -91,7 +91,7 @@
         <w:t xml:space="preserve">• Base Path dịch vụ File (Upload): </w:t>
       </w:r>
       <w:r>
-        <w:t>/api/files</w:t>
+        <w:t>/file-service/api/files</w:t>
         <w:br/>
       </w:r>
       <w:r>
@@ -101,7 +101,17 @@
         <w:t xml:space="preserve">• Base Path dịch vụ Nhạc (Library): </w:t>
       </w:r>
       <w:r>
-        <w:t>/library</w:t>
+        <w:t>/crbt-community-library/library</w:t>
+        <w:br/>
+      </w:r>
+      <w:r>
+        <w:rPr>
+          <w:b/>
+        </w:rPr>
+        <w:t xml:space="preserve">• Các Bucket MinIO sử dụng: </w:t>
+      </w:r>
+      <w:r>
+        <w:t>media-temp (tạm thời), media-audio (nhạc cá nhân), media-audio-lib (thư viện nhạc nền admin), media-images (ảnh bìa)</w:t>
         <w:br/>
       </w:r>
       <w:r>
@@ -152,7 +162,7 @@
         <w:t xml:space="preserve">• API: </w:t>
       </w:r>
       <w:r>
-        <w:t>GET /api/files/presigned/upload?originalName=ten_file.mp3&amp;contentType=audio/mpeg</w:t>
+        <w:t>GET /file-service/api/files/presigned/upload?originalName=ten_file.mp3&amp;contentType=audio/mpeg</w:t>
         <w:br/>
       </w:r>
       <w:r>
@@ -162,7 +172,7 @@
         <w:t xml:space="preserve">• Response nhận về gồm: </w:t>
       </w:r>
       <w:r>
-        <w:t>fileId (ID file trong DB), uploadUrl (URL ký sẵn của MinIO), và storedKey.</w:t>
+        <w:t>fileId (ID file trong DB), objectKey, và url (URL ký sẵn của MinIO - đã được map với IP ngoại/localhost thực tế).</w:t>
         <w:br/>
         <w:br/>
       </w:r>
@@ -194,7 +204,7 @@
         <w:t xml:space="preserve">• URL: </w:t>
       </w:r>
       <w:r>
-        <w:t>Sử dụng chính xác giá trị 'uploadUrl' nhận ở Bước 1.</w:t>
+        <w:t>Sử dụng chính xác giá trị 'url' nhận ở Bước 1.</w:t>
         <w:br/>
       </w:r>
       <w:r>
@@ -204,7 +214,7 @@
         <w:t xml:space="preserve">• Header: </w:t>
       </w:r>
       <w:r>
-        <w:t>Content-Type đặt là 'audio/mpeg' (MP3) hoặc 'audio/wav' (WAV) tương ứng.</w:t>
+        <w:t>Content-Type đặt là 'audio/mpeg' (MP3) hoặc 'audio/wav' (WAV) tương ứng. (Lưu ý chọn Authorization = No Auth).</w:t>
         <w:br/>
       </w:r>
       <w:r>
@@ -236,7 +246,7 @@
         <w:t xml:space="preserve">• API: </w:t>
       </w:r>
       <w:r>
-        <w:t>POST /api/files/{fileId}/confirm</w:t>
+        <w:t>POST /file-service/api/files/{fileId}/confirm</w:t>
         <w:br/>
       </w:r>
       <w:r>
@@ -246,7 +256,7 @@
         <w:t xml:space="preserve">• Body: </w:t>
       </w:r>
       <w:r>
-        <w:t>{"targetBucket": "audio"}</w:t>
+        <w:t>{"targetBucket": "media-audio-lib"} (hoặc "media-audio" đối với nhạc cá nhân của user)</w:t>
         <w:br/>
       </w:r>
       <w:r>
@@ -256,7 +266,7 @@
         <w:t xml:space="preserve">• Response trả về chứa: </w:t>
       </w:r>
       <w:r>
-        <w:t>đường dẫn file cuối cùng ('audioUrl').</w:t>
+        <w:t>đường dẫn file cuối cùng ('storedKey').</w:t>
         <w:br/>
         <w:br/>
       </w:r>
@@ -278,7 +288,7 @@
         <w:t xml:space="preserve">• API: </w:t>
       </w:r>
       <w:r>
-        <w:t>POST /library/ringtones</w:t>
+        <w:t>POST /crbt-community-library/library/ringtones</w:t>
         <w:br/>
       </w:r>
       <w:r>
@@ -288,7 +298,7 @@
         <w:t xml:space="preserve">• Body: </w:t>
       </w:r>
       <w:r>
-        <w:t>{"title": "Tên bài nhạc", "artistName": "Ca sĩ/Tác giả", "audioUrl": "audioUrl_nhận_ở_bước_3", "mood": "Tâm trạng", "status": true, "categoryId": 1}</w:t>
+        <w:t>{"title": "Tên bài nhạc", "artistName": "Ca sĩ/Tác giả", "audioUrl": "Đường dẫn nhạc từ bước 3 hoặc full URL MinIO ngoại", "moodId": 3, "status": true, "categoryId": 1}</w:t>
         <w:br/>
       </w:r>
     </w:p>
@@ -525,7 +535,7 @@
         <w:t xml:space="preserve">• Method / Path: </w:t>
       </w:r>
       <w:r>
-        <w:t>GET /library/ringtones/search</w:t>
+        <w:t>GET /crbt-community-library/library/ringtones/search</w:t>
         <w:br/>
       </w:r>
       <w:r>
@@ -541,6 +551,10 @@
       </w:r>
       <w:r>
         <w:t xml:space="preserve">  - categoryId (long): Lọc theo Thể loại nhạc.</w:t>
+        <w:br/>
+      </w:r>
+      <w:r>
+        <w:t xml:space="preserve">  - moodId (long): Lọc theo Tâm trạng nhạc.</w:t>
         <w:br/>
       </w:r>
       <w:r>
@@ -590,9 +604,9 @@
         </w:rPr>
         <w:t>{</w:t>
         <w:br/>
-        <w:t xml:space="preserve">  "code": 0,</w:t>
+        <w:t xml:space="preserve">  "success": true,</w:t>
         <w:br/>
-        <w:t xml:space="preserve">  "message": "Success",</w:t>
+        <w:t xml:space="preserve">  "message": "OK",</w:t>
         <w:br/>
         <w:t xml:space="preserve">  "data": {</w:t>
         <w:br/>
@@ -600,29 +614,55 @@
         <w:br/>
         <w:t xml:space="preserve">      {</w:t>
         <w:br/>
-        <w:t xml:space="preserve">        "id": 1,</w:t>
+        <w:t xml:space="preserve">        "id": 6,</w:t>
         <w:br/>
-        <w:t xml:space="preserve">        "title": "Lạc Trôi",</w:t>
+        <w:t xml:space="preserve">        "title": "Warm Morning Acoustic",</w:t>
         <w:br/>
-        <w:t xml:space="preserve">        "artistName": "Sơn Tùng M-TP",</w:t>
+        <w:t xml:space="preserve">        "artistName": "Sunny Vibes",</w:t>
         <w:br/>
-        <w:t xml:space="preserve">        "audioUrl": "http://minio:9000/audio/lac-troi.mp3",</w:t>
+        <w:t xml:space="preserve">        "audioUrl": "http://103.154.62.118:9000/media-audio-lib/a33cb5e5-109a-4c41-ba39-9c4fbfa09666-zoluushka-guitar-type-beat.mp3",</w:t>
         <w:br/>
-        <w:t xml:space="preserve">        "coverImageUrl": "http://minio:9000/image/cover-1.jpg",</w:t>
+        <w:t xml:space="preserve">        "coverImageUrl": "http://localhost:9000/media-images/cover.jpg",</w:t>
         <w:br/>
-        <w:t xml:space="preserve">        "durationSeconds": 30,</w:t>
+        <w:t xml:space="preserve">        "durationSeconds": 173,</w:t>
         <w:br/>
         <w:t xml:space="preserve">        "featured": true,</w:t>
         <w:br/>
-        <w:t xml:space="preserve">        "mood": "Happy",</w:t>
-        <w:br/>
         <w:t xml:space="preserve">        "status": true,</w:t>
         <w:br/>
-        <w:t xml:space="preserve">        "selectionCount": 2500,</w:t>
+        <w:t xml:space="preserve">        "selectionCount": 0,</w:t>
         <w:br/>
-        <w:t xml:space="preserve">        "category": { "id": 5, "name": "V-Pop" },</w:t>
+        <w:t xml:space="preserve">        "category": {</w:t>
         <w:br/>
-        <w:t xml:space="preserve">        "createdAt": "2026-05-27T10:00:00Z"</w:t>
+        <w:t xml:space="preserve">          "id": 1,</w:t>
+        <w:br/>
+        <w:t xml:space="preserve">          "name": "Pop",</w:t>
+        <w:br/>
+        <w:t xml:space="preserve">          "description": "Popular mainstream music",</w:t>
+        <w:br/>
+        <w:t xml:space="preserve">          "createdAt": "2026-05-25T13:23:33.108Z",</w:t>
+        <w:br/>
+        <w:t xml:space="preserve">          "updatedAt": null</w:t>
+        <w:br/>
+        <w:t xml:space="preserve">        },</w:t>
+        <w:br/>
+        <w:t xml:space="preserve">        "mood": {</w:t>
+        <w:br/>
+        <w:t xml:space="preserve">          "id": 3,</w:t>
+        <w:br/>
+        <w:t xml:space="preserve">          "name": "Chill",</w:t>
+        <w:br/>
+        <w:t xml:space="preserve">          "description": "Thư giãn, nhẹ nhàng, êm dịu",</w:t>
+        <w:br/>
+        <w:t xml:space="preserve">          "createdAt": "2026-05-27T15:15:21Z",</w:t>
+        <w:br/>
+        <w:t xml:space="preserve">          "updatedAt": null</w:t>
+        <w:br/>
+        <w:t xml:space="preserve">        },</w:t>
+        <w:br/>
+        <w:t xml:space="preserve">        "createdAt": "2026-05-27T16:11:19Z",</w:t>
+        <w:br/>
+        <w:t xml:space="preserve">        "updatedAt": "2026-05-27T16:11:19Z"</w:t>
         <w:br/>
         <w:t xml:space="preserve">      }</w:t>
         <w:br/>
@@ -665,7 +705,7 @@
         <w:t xml:space="preserve">• Method / Path: </w:t>
       </w:r>
       <w:r>
-        <w:t>GET /library/ringtones/export</w:t>
+        <w:t>GET /crbt-community-library/library/ringtones/export</w:t>
         <w:br/>
       </w:r>
       <w:r>
@@ -710,7 +750,7 @@
         <w:t xml:space="preserve">• Method / Path: </w:t>
       </w:r>
       <w:r>
-        <w:t>POST /library/ringtones</w:t>
+        <w:t>POST /crbt-community-library/library/ringtones</w:t>
         <w:br/>
       </w:r>
       <w:r>
@@ -732,19 +772,19 @@
         </w:rPr>
         <w:t>{</w:t>
         <w:br/>
-        <w:t xml:space="preserve">  "title": "Animals",</w:t>
+        <w:t xml:space="preserve">  "title": "Warm Morning Acoustic",</w:t>
         <w:br/>
-        <w:t xml:space="preserve">  "artistName": "Martin Garrix",</w:t>
+        <w:t xml:space="preserve">  "artistName": "Sunny Vibes",</w:t>
         <w:br/>
-        <w:t xml:space="preserve">  "audioUrl": "http://minio:9000/audio/animals.mp3", // Lấy từ Bước 3</w:t>
+        <w:t xml:space="preserve">  "audioUrl": "http://103.154.62.118:9000/media-audio-lib/a33cb5e5-109a-4c41-ba39-9c4fbfa09666-guitar.mp3", // storedKey</w:t>
         <w:br/>
-        <w:t xml:space="preserve">  "coverImageUrl": "http://minio:9000/image/animals.jpg",</w:t>
+        <w:t xml:space="preserve">  "coverImageUrl": "http://localhost:9000/media-images/cover.jpg",</w:t>
         <w:br/>
-        <w:t xml:space="preserve">  "mood": "Energetic",</w:t>
+        <w:t xml:space="preserve">  "moodId": 3, // ID Tâm trạng lấy từ API danh mục Mood (Ví dụ: 3 = Chill)</w:t>
         <w:br/>
         <w:t xml:space="preserve">  "status": true,</w:t>
         <w:br/>
-        <w:t xml:space="preserve">  "categoryId": 3</w:t>
+        <w:t xml:space="preserve">  "categoryId": 1 // ID Thể loại lấy từ API danh mục Category (Ví dụ: 1 = Pop)</w:t>
         <w:br/>
         <w:t>}</w:t>
       </w:r>
@@ -771,7 +811,7 @@
         <w:t xml:space="preserve">• Method / Path: </w:t>
       </w:r>
       <w:r>
-        <w:t>PUT /library/ringtones/{id}</w:t>
+        <w:t>PUT /crbt-community-library/library/ringtones/{id}</w:t>
         <w:br/>
       </w:r>
       <w:r>
@@ -793,15 +833,15 @@
         </w:rPr>
         <w:t>{</w:t>
         <w:br/>
-        <w:t xml:space="preserve">  "title": "Animals (Radio Edit)",</w:t>
+        <w:t xml:space="preserve">  "title": "Warm Morning Acoustic (Guitar Edit)",</w:t>
         <w:br/>
-        <w:t xml:space="preserve">  "artistName": "Martin Garrix",</w:t>
+        <w:t xml:space="preserve">  "artistName": "Sunny Vibes",</w:t>
         <w:br/>
-        <w:t xml:space="preserve">  "mood": "Dance",</w:t>
+        <w:t xml:space="preserve">  "moodId": 3,</w:t>
         <w:br/>
         <w:t xml:space="preserve">  "status": true,</w:t>
         <w:br/>
-        <w:t xml:space="preserve">  "categoryId": 3</w:t>
+        <w:t xml:space="preserve">  "categoryId": 1</w:t>
         <w:br/>
         <w:t>}</w:t>
       </w:r>
@@ -828,7 +868,7 @@
         <w:t xml:space="preserve">• Method / Path: </w:t>
       </w:r>
       <w:r>
-        <w:t>PATCH /library/ringtones/{id}/status</w:t>
+        <w:t>PATCH /crbt-community-library/library/ringtones/{id}/status</w:t>
         <w:br/>
       </w:r>
       <w:r>
@@ -877,7 +917,7 @@
         <w:t xml:space="preserve">• Method / Path: </w:t>
       </w:r>
       <w:r>
-        <w:t>DELETE /library/ringtones/{id}</w:t>
+        <w:t>DELETE /crbt-community-library/library/ringtones/{id}</w:t>
         <w:br/>
       </w:r>
       <w:r>
@@ -888,6 +928,237 @@
       </w:r>
       <w:r>
         <w:t>Xóa hoàn toàn thông tin bài nhạc khỏi kho quản lý và gửi tín hiệu xóa file vật lý trên MinIO. Lượt sử dụng thống kê được sao lưu an toàn tự động ở phía DB để chạy báo cáo sau này.</w:t>
+        <w:br/>
+        <w:br/>
+      </w:r>
+    </w:p>
+    <w:p>
+      <w:pPr>
+        <w:pStyle w:val="Heading2"/>
+        <w:spacing w:before="240" w:after="80"/>
+      </w:pPr>
+      <w:r>
+        <w:rPr>
+          <w:rFonts w:ascii="Segoe UI" w:hAnsi="Segoe UI"/>
+          <w:color w:val="5C768D"/>
+          <w:sz w:val="28"/>
+        </w:rPr>
+        <w:t>API 8: Quản lý Thể loại (Categories CRUD)</w:t>
+      </w:r>
+    </w:p>
+    <w:p>
+      <w:r>
+        <w:rPr>
+          <w:b/>
+        </w:rPr>
+        <w:t>1. Lấy danh sách thể loại:</w:t>
+        <w:br/>
+      </w:r>
+      <w:r>
+        <w:rPr>
+          <w:i/>
+        </w:rPr>
+        <w:t xml:space="preserve">• Method / Path: </w:t>
+      </w:r>
+      <w:r>
+        <w:t>GET /crbt-community-library/library/categories</w:t>
+        <w:br/>
+      </w:r>
+      <w:r>
+        <w:rPr>
+          <w:b/>
+        </w:rPr>
+        <w:t>2. Thêm mới thể loại:</w:t>
+        <w:br/>
+      </w:r>
+      <w:r>
+        <w:rPr>
+          <w:i/>
+        </w:rPr>
+        <w:t xml:space="preserve">• Method / Path: </w:t>
+      </w:r>
+      <w:r>
+        <w:t>POST /crbt-community-library/library/categories</w:t>
+        <w:br/>
+      </w:r>
+      <w:r>
+        <w:rPr>
+          <w:i/>
+        </w:rPr>
+        <w:t xml:space="preserve">• Body: </w:t>
+      </w:r>
+      <w:r>
+        <w:t>{"name": "Thể loại mới", "description": "Mô tả"}</w:t>
+        <w:br/>
+      </w:r>
+      <w:r>
+        <w:rPr>
+          <w:b/>
+        </w:rPr>
+        <w:t>3. Cập nhật thể loại:</w:t>
+        <w:br/>
+      </w:r>
+      <w:r>
+        <w:rPr>
+          <w:i/>
+        </w:rPr>
+        <w:t xml:space="preserve">• Method / Path: </w:t>
+      </w:r>
+      <w:r>
+        <w:t>PUT /crbt-community-library/library/categories/{id}</w:t>
+        <w:br/>
+      </w:r>
+      <w:r>
+        <w:rPr>
+          <w:i/>
+        </w:rPr>
+        <w:t xml:space="preserve">• Body: </w:t>
+      </w:r>
+      <w:r>
+        <w:t>{"name": "Tên cập nhật", "description": "Mô tả mới"}</w:t>
+        <w:br/>
+      </w:r>
+      <w:r>
+        <w:rPr>
+          <w:b/>
+        </w:rPr>
+        <w:t>4. Xóa thể loại:</w:t>
+        <w:br/>
+      </w:r>
+      <w:r>
+        <w:rPr>
+          <w:i/>
+        </w:rPr>
+        <w:t xml:space="preserve">• Method / Path: </w:t>
+      </w:r>
+      <w:r>
+        <w:t>DELETE /crbt-community-library/library/categories/{id}</w:t>
+        <w:br/>
+      </w:r>
+      <w:r>
+        <w:rPr>
+          <w:b/>
+        </w:rPr>
+        <w:t xml:space="preserve">• Lưu ý: </w:t>
+      </w:r>
+      <w:r>
+        <w:t>Không cho phép xóa nếu danh mục này đang có bài nhạc sử dụng (trả về lỗi validation).</w:t>
+        <w:br/>
+        <w:br/>
+      </w:r>
+    </w:p>
+    <w:p>
+      <w:pPr>
+        <w:pStyle w:val="Heading2"/>
+        <w:spacing w:before="240" w:after="80"/>
+      </w:pPr>
+      <w:r>
+        <w:rPr>
+          <w:rFonts w:ascii="Segoe UI" w:hAnsi="Segoe UI"/>
+          <w:color w:val="5C768D"/>
+          <w:sz w:val="28"/>
+        </w:rPr>
+        <w:t>API 9: Quản lý Tâm trạng (Moods CRUD)</w:t>
+      </w:r>
+    </w:p>
+    <w:p>
+      <w:r>
+        <w:rPr>
+          <w:b/>
+        </w:rPr>
+        <w:t>1. Lấy danh sách tâm trạng:</w:t>
+        <w:br/>
+      </w:r>
+      <w:r>
+        <w:rPr>
+          <w:i/>
+        </w:rPr>
+        <w:t xml:space="preserve">• Method / Path: </w:t>
+      </w:r>
+      <w:r>
+        <w:t>GET /crbt-community-library/library/moods</w:t>
+        <w:br/>
+      </w:r>
+      <w:r>
+        <w:rPr>
+          <w:b/>
+        </w:rPr>
+        <w:t>2. Thêm mới tâm trạng:</w:t>
+        <w:br/>
+      </w:r>
+      <w:r>
+        <w:rPr>
+          <w:i/>
+        </w:rPr>
+        <w:t xml:space="preserve">• Method / Path: </w:t>
+      </w:r>
+      <w:r>
+        <w:t>POST /crbt-community-library/library/moods</w:t>
+        <w:br/>
+      </w:r>
+      <w:r>
+        <w:rPr>
+          <w:i/>
+        </w:rPr>
+        <w:t xml:space="preserve">• Body: </w:t>
+      </w:r>
+      <w:r>
+        <w:t>{"name": "Tâm trạng mới", "description": "Mô tả"}</w:t>
+        <w:br/>
+      </w:r>
+      <w:r>
+        <w:rPr>
+          <w:b/>
+        </w:rPr>
+        <w:t>3. Cập nhật tâm trạng:</w:t>
+        <w:br/>
+      </w:r>
+      <w:r>
+        <w:rPr>
+          <w:i/>
+        </w:rPr>
+        <w:t xml:space="preserve">• Method / Path: </w:t>
+      </w:r>
+      <w:r>
+        <w:t>PUT /crbt-community-library/library/moods/{id}</w:t>
+        <w:br/>
+      </w:r>
+      <w:r>
+        <w:rPr>
+          <w:i/>
+        </w:rPr>
+        <w:t xml:space="preserve">• Body: </w:t>
+      </w:r>
+      <w:r>
+        <w:t>{"name": "Tên cập nhật", "description": "Mô tả mới"}</w:t>
+        <w:br/>
+      </w:r>
+      <w:r>
+        <w:rPr>
+          <w:b/>
+        </w:rPr>
+        <w:t>4. Xóa tâm trạng:</w:t>
+        <w:br/>
+      </w:r>
+      <w:r>
+        <w:rPr>
+          <w:i/>
+        </w:rPr>
+        <w:t xml:space="preserve">• Method / Path: </w:t>
+      </w:r>
+      <w:r>
+        <w:t>DELETE /crbt-community-library/library/moods/{id}</w:t>
+        <w:br/>
+      </w:r>
+      <w:r>
+        <w:rPr>
+          <w:b/>
+        </w:rPr>
+        <w:t xml:space="preserve">• Lưu ý: </w:t>
+      </w:r>
+      <w:r>
+        <w:t>Không cho phép xóa nếu tâm trạng này đang được sử dụng bởi bài nhạc nào trong hệ thống.</w:t>
+        <w:br/>
       </w:r>
     </w:p>
     <w:sectPr>

</xml_diff>